<commit_message>
Update Word report to include combined structural matrix for US and Russian crops
</commit_message>
<xml_diff>
--- a/Daily Reports/Ma_Tran_Mua_Vu_Toan_Dien_2026.docx
+++ b/Daily Reports/Ma_Tran_Mua_Vu_Toan_Dien_2026.docx
@@ -8,7 +8,7 @@
         <w:jc w:val="center"/>
       </w:pPr>
       <w:r>
-        <w:t>BÁO CÁO TOÀN DIỆN: MA TRẬN MÙA VỤ NÔNG SẢN</w:t>
+        <w:t>BÁO CÁO TOÀN DIỆN: MA TRẬN MÙA VỤ NÔNG SẢN 2026</w:t>
       </w:r>
     </w:p>
     <w:p>
@@ -16,12 +16,12 @@
         <w:jc w:val="center"/>
       </w:pPr>
       <w:r>
-        <w:t>(BẢN CẬP NHẬT CHUYÊN SÂU - ĐẦU THÁNG 7/2026)</w:t>
+        <w:t>(NGÔ &amp; LÚA MÌ - BẢN CẬP NHẬT CHUYÊN SÂU)</w:t>
       </w:r>
     </w:p>
     <w:p>
       <w:r>
-        <w:t>Báo cáo này là bản tổng hợp ở cấp độ chuyên gia (Merchandiser), kết hợp khối lượng Big Data mới nhất từ USDA (Acreage 30/06), dự báo El Niño, và sự phân hóa tiến độ thu hoạch chéo giữa các cường quốc nông nghiệp toàn cầu. Trọng tâm tuyệt đối: Lúa mì (ZW) và Ngô (ZC).</w:t>
+        <w:t>Báo cáo này là bản tổng hợp ở cấp độ chuyên gia (Merchandiser), kết hợp khối lượng Big Data mới nhất từ USDA (Acreage 30/06), dự báo El Niño, và sự phân hóa tiến độ thu hoạch chéo giữa các cường quốc nông nghiệp toàn cầu. Trọng tâm tuyệt đối: Tích hợp sự ảnh hưởng của Lúa Mì Nga vào bức tranh của Mỹ.</w:t>
       </w:r>
     </w:p>
     <w:p>
@@ -79,7 +79,7 @@
         <w:t xml:space="preserve">Hiệu ứng Giảm xóc (Mùa Thu Mỹ): </w:t>
       </w:r>
       <w:r>
-        <w:t>Dự báo Mỹ sẽ đón những cơn mưa vàng vào giai đoạn T9-T11, rất tốt cho việc gieo hạt Lúa đông 2027. Yếu tố này đóng vai trò như một 'Nắp đập tâm lý' (Cap), giúp đà tăng giá Quý 4 không bị ngáo giá mất kiểm soát, nhưng tuyệt đối không thể bẻ gãy xu hướng tăng vì thế giới đang thiếu hụt vật chất ngay hiện tại.</w:t>
+        <w:t>Dự báo Mỹ sẽ đón những cơn mưa vàng vào giai đoạn T9-T11, rất tốt cho việc gieo hạt Lúa đông 2027. Yếu tố này đóng vai trò như một 'Nắp đập tâm lý' (Cap), giúp đà tăng giá Quý 4 không bị ngáo giá mất kiểm soát.</w:t>
       </w:r>
     </w:p>
     <w:p>
@@ -154,12 +154,12 @@
         <w:rPr>
           <w:color w:val="003366"/>
         </w:rPr>
-        <w:t>PHẦN 3: CHUYÊN ĐỀ LÚA MÌ NGA &amp; BIỂN ĐEN (THE RUSSIAN FACTOR)</w:t>
+        <w:t>PHẦN 3: PHÂN TÍCH MA TRẬN LÚA MÌ (WHEAT - ZW) &amp; YẾU TỐ NGA</w:t>
       </w:r>
     </w:p>
     <w:p>
       <w:r>
-        <w:t>Nga nắm giữ 25% thị phần xuất khẩu lúa mì toàn cầu. Sản lượng và chính sách xuất khẩu của Nga là yếu tố quyết định giá trần (Ceiling Price) của lúa mì CBOT trong Quý 3/2026.</w:t>
+        <w:t>Thị trường lúa mì năm 2026 là một bức tranh phân hóa sâu sắc. Nếu chỉ nhìn vào nước Mỹ, giá lúa mì đáng lẽ phải tăng phi mã. Tuy nhiên, giá thực tế lại bị ghìm chân bởi 'Ông trùm' Biển Đen.</w:t>
       </w:r>
     </w:p>
     <w:p>
@@ -170,148 +170,7 @@
         <w:rPr>
           <w:color w:val="003366"/>
         </w:rPr>
-        <w:t>3.1 Số Liệu Định Lượng (Cập Nhật Bằng AI)</w:t>
-      </w:r>
-    </w:p>
-    <w:p>
-      <w:pPr>
-        <w:pStyle w:val="ListBullet"/>
-      </w:pPr>
-      <w:r>
-        <w:rPr>
-          <w:b/>
-        </w:rPr>
-        <w:t xml:space="preserve">Diện tích gieo trồng: </w:t>
-      </w:r>
-      <w:r>
-        <w:t>N/A</w:t>
-      </w:r>
-    </w:p>
-    <w:p>
-      <w:pPr>
-        <w:pStyle w:val="ListBullet"/>
-      </w:pPr>
-      <w:r>
-        <w:rPr>
-          <w:b/>
-        </w:rPr>
-        <w:t xml:space="preserve">Sản lượng dự báo: </w:t>
-      </w:r>
-      <w:r>
-        <w:t>Dự báo vụ mùa 2025 dưới mức trung bình; 28 triệu tấn đã được thu hoạch (chưa phải tổng sản lượng cuối cùng).</w:t>
-      </w:r>
-    </w:p>
-    <w:p>
-      <w:pPr>
-        <w:pStyle w:val="ListBullet"/>
-      </w:pPr>
-      <w:r>
-        <w:rPr>
-          <w:b/>
-        </w:rPr>
-        <w:t xml:space="preserve">Tiến độ thu hoạch: </w:t>
-      </w:r>
-      <w:r>
-        <w:t>Đang diễn ra, 28 triệu tấn đã được thu hoạch, năng suất giảm 4.5%.</w:t>
-      </w:r>
-    </w:p>
-    <w:p>
-      <w:pPr>
-        <w:pStyle w:val="ListBullet"/>
-      </w:pPr>
-      <w:r>
-        <w:rPr>
-          <w:b/>
-        </w:rPr>
-        <w:t xml:space="preserve">Thời gian thu hoạch: </w:t>
-      </w:r>
-      <w:r>
-        <w:t>Tháng 7 - Tháng 8 (Vụ Đông), Tháng 8 - Tháng 9 (Vụ Xuân)</w:t>
-      </w:r>
-    </w:p>
-    <w:p>
-      <w:pPr>
-        <w:pStyle w:val="ListBullet"/>
-      </w:pPr>
-      <w:r>
-        <w:rPr>
-          <w:b/>
-        </w:rPr>
-        <w:t xml:space="preserve">Giá giao ngay (FOB): </w:t>
-      </w:r>
-      <w:r>
-        <w:t>N/A</w:t>
-      </w:r>
-    </w:p>
-    <w:p>
-      <w:pPr>
-        <w:pStyle w:val="ListBullet"/>
-      </w:pPr>
-      <w:r>
-        <w:rPr>
-          <w:b/>
-        </w:rPr>
-        <w:t xml:space="preserve">Năng lực xuất khẩu: </w:t>
-      </w:r>
-      <w:r>
-        <w:t>N/A</w:t>
-      </w:r>
-    </w:p>
-    <w:p>
-      <w:pPr>
-        <w:pStyle w:val="ListBullet"/>
-      </w:pPr>
-      <w:r>
-        <w:rPr>
-          <w:b/>
-        </w:rPr>
-        <w:t xml:space="preserve">Đánh giá chất lượng: </w:t>
-      </w:r>
-      <w:r>
-        <w:t>Năng suất giảm 4.5%; vụ mùa bị ảnh hưởng nặng nề, có thể dẫn đến chất lượng hoặc số lượng thấp hơn.</w:t>
-      </w:r>
-    </w:p>
-    <w:p>
-      <w:pPr>
-        <w:pStyle w:val="Heading2"/>
-      </w:pPr>
-      <w:r>
-        <w:rPr>
-          <w:color w:val="003366"/>
-        </w:rPr>
-        <w:t>3.2 Nhận Định Áp Lực Xả Hàng</w:t>
-      </w:r>
-    </w:p>
-    <w:p>
-      <w:r>
-        <w:t>Mặc dù giá lúa mì Biển Đen có thời điểm cạnh tranh nhất thế giới, các vấn đề về logistics, thời tiết xấu tại cảng và nguồn cung thắt chặt có thể hạn chế áp lực xả hàng của Nga lên giá CBOT.</w:t>
-      </w:r>
-    </w:p>
-    <w:p>
-      <w:r>
-        <w:br w:type="page"/>
-      </w:r>
-    </w:p>
-    <w:p>
-      <w:pPr>
-        <w:pStyle w:val="Heading1"/>
-      </w:pPr>
-      <w:r>
-        <w:rPr>
-          <w:color w:val="003366"/>
-        </w:rPr>
-        <w:t>PHẦN 4: MA TRẬN LÚA MÌ MỸ (WHEAT - ZW) - TỔNG HỢP</w:t>
-      </w:r>
-    </w:p>
-    <w:p>
-      <w:pPr>
-        <w:pStyle w:val="Heading2"/>
-      </w:pPr>
-      <w:r>
-        <w:rPr>
-          <w:color w:val="003366"/>
-        </w:rPr>
-        <w:t>4.1 Những con số Lịch sử (Cập nhật 30/06)</w:t>
+        <w:t>3.1 Những con số Lịch sử của Mỹ (Yếu tố Bullish)</w:t>
       </w:r>
     </w:p>
     <w:p>
@@ -344,16 +203,32 @@
     </w:p>
     <w:p>
       <w:pPr>
+        <w:pStyle w:val="Heading2"/>
+      </w:pPr>
+      <w:r>
+        <w:rPr>
+          <w:color w:val="003366"/>
+        </w:rPr>
+        <w:t>3.2 Sự thống trị của Nga trong Tháng 7 (Yếu tố Bearish)</w:t>
+      </w:r>
+    </w:p>
+    <w:p>
+      <w:r>
+        <w:t>Nga nắm giữ 25% thị phần xuất khẩu lúa mì toàn cầu. Sản lượng và chính sách xuất khẩu của Nga là yếu tố quyết định giá trần (Ceiling Price) của lúa mì CBOT trong Quý 3/2026.</w:t>
+      </w:r>
+    </w:p>
+    <w:p>
+      <w:pPr>
         <w:pStyle w:val="ListBullet"/>
       </w:pPr>
       <w:r>
         <w:rPr>
           <w:b/>
         </w:rPr>
-        <w:t xml:space="preserve">Cạnh tranh từ Nga: </w:t>
+        <w:t xml:space="preserve">Quyền lực Tháng 7 (Harvest Pressure): </w:t>
       </w:r>
       <w:r>
-        <w:t>Như phân tích ở Phần 3, lúa mì Mỹ phải đối mặt với áp lực giảm giá (Price Match) từ dòng lúa mì Nga đang xả kho.</w:t>
+        <w:t>Khi Nga bước vào vụ gặt, lượng hàng khổng lồ đổ về các cảng Biển Đen. Họ thường bán phá giá (Dumping) qua giá FOB để thu ngoại tệ. Bất kể Mỹ đang hạn hán, lúa mì Mỹ (SRW/HRW) bắt buộc phải 'Price Match' (giảm giá theo) để cạnh tranh xuất khẩu.</w:t>
       </w:r>
     </w:p>
     <w:p>
@@ -364,12 +239,12 @@
         <w:rPr>
           <w:color w:val="003366"/>
         </w:rPr>
-        <w:t>4.2 Cấu trúc "Đáy U-Shape" và Sóng vỗ bờ liên tục</w:t>
+        <w:t>3.3 Cấu trúc "Đáy U-Shape" và Sóng vỗ bờ liên tục</w:t>
       </w:r>
     </w:p>
     <w:p>
       <w:r>
-        <w:t>Khác với mọi năm, Mỹ và Nga năm nay xả hàng bị chệch nhịp (Lag), tạo ra một vùng đáy lê lết kéo dài suốt tháng 7 và tháng 8 thay vì V-Shape:</w:t>
+        <w:t>Sự chênh lệch giữa Mỹ (Bullish) và Nga (Bearish) tạo ra một chu kỳ giá rất đặc thù cho ZW: Đáy U-Shape (Kéo dài).</w:t>
       </w:r>
     </w:p>
     <w:p>
@@ -380,10 +255,10 @@
         <w:rPr>
           <w:b/>
         </w:rPr>
-        <w:t xml:space="preserve">Sóng 1 (Đầu đến giữa T7): </w:t>
+        <w:t xml:space="preserve">Nhịp 1 (Tháng 7) - Rủi ro Bull Trap: </w:t>
       </w:r>
       <w:r>
-        <w:t>Lúa đông Mỹ đang ở đỉnh cao gặt (48% - 60%). Tạo ra nhịp Washout hình thành ĐÁY 1. Giá có thể có bẫy tăng giả sau nhịp này.</w:t>
+        <w:t>Mỹ gặt lúa đông kết hợp với Nga bắt đầu đưa hàng ra Biển Đen. Giá CBOT bị đè bẹp. Rất nhiều trader phân tích cơ bản (chỉ nhìn hạn hán của Mỹ) sẽ vội vã MUA tại đây và dính Bẫy (Bull Trap).</w:t>
       </w:r>
     </w:p>
     <w:p>
@@ -394,10 +269,21 @@
         <w:rPr>
           <w:b/>
         </w:rPr>
-        <w:t xml:space="preserve">Sóng 2 (Cuối T7): </w:t>
+        <w:t xml:space="preserve">Nhịp 2 (Tháng 8) - Điểm Mua Vàng: </w:t>
       </w:r>
       <w:r>
-        <w:t>Khi Mỹ hạ nhiệt, lúa mì Biển Đen của Nga bắt đầu tràn ngập cảng FOB, tiếp tục đè bẹp giá, kéo dài vùng đáy chán nản.</w:t>
+        <w:t>Nga đã qua đỉnh xả hàng. Mỹ bắt đầu gặt Lúa xuân (năng suất thảm hại do nắng nóng Tháng 7 lộ diện). Áp lực từ Nga giảm + Cú sốc từ Mỹ tăng = Điểm uốn của thị trường (Market Inflection Point).</w:t>
+      </w:r>
+    </w:p>
+    <w:p>
+      <w:pPr>
+        <w:pStyle w:val="Heading2"/>
+      </w:pPr>
+      <w:r>
+        <w:rPr>
+          <w:color w:val="003366"/>
+        </w:rPr>
+        <w:t>3.4 Chiến lược Thực chiến (Golden Zone)</w:t>
       </w:r>
     </w:p>
     <w:p>
@@ -408,10 +294,36 @@
         <w:rPr>
           <w:b/>
         </w:rPr>
-        <w:t xml:space="preserve">Cú chốt hạ (Tháng 8): </w:t>
+        <w:t xml:space="preserve">Tháng 7: </w:t>
       </w:r>
       <w:r>
-        <w:t>Gặt Lúa xuân Mỹ. Diện tích quá bé + nắng nóng sẽ làm lộ ra sự thiếu hụt. Đây là ĐÁY 2 (Vùng Rũ Bỏ Cuối Cùng).</w:t>
+        <w:t>Nghiêm cấm All-in Mua lên (Long). Vùng giá 570 - 585 là vùng giá rẻ, nhưng chỉ nên giải ngân 20% - 30% vốn để dò đường. Mọi đợt hồi phục đều có xác suất cao là bẫy săn thanh khoản.</w:t>
+      </w:r>
+    </w:p>
+    <w:p>
+      <w:pPr>
+        <w:pStyle w:val="ListBullet"/>
+      </w:pPr>
+      <w:r>
+        <w:rPr>
+          <w:b/>
+        </w:rPr>
+        <w:t xml:space="preserve">Tháng 8 &amp; Tháng 9: </w:t>
+      </w:r>
+      <w:r>
+        <w:t>Phục kích Cú nổ (The Breakout). Canh các tín hiệu SMC (MSS) trên khung H4/D1 tại vùng giá đáy khi tin tức xả hàng của Nga đã bão hòa (Priced-in). Dồn hỏa lực mua mạnh.</w:t>
+      </w:r>
+    </w:p>
+    <w:p>
+      <w:r>
+        <w:rPr>
+          <w:b/>
+        </w:rPr>
+        <w:t xml:space="preserve">   =&gt; Mục tiêu chốt lời dài hạn: </w:t>
+      </w:r>
+      <w:r>
+        <w:t>680.00 - 720.00+ cents.</w:t>
+        <w:br/>
       </w:r>
     </w:p>
     <w:p>
@@ -422,250 +334,7 @@
         <w:rPr>
           <w:color w:val="003366"/>
         </w:rPr>
-        <w:t>4.3 Chiến lược Thực chiến (Golden Zone)</w:t>
-      </w:r>
-    </w:p>
-    <w:p>
-      <w:r>
-        <w:rPr>
-          <w:b/>
-        </w:rPr>
-        <w:t xml:space="preserve">   =&gt; Vùng Gom Hàng Tối Ưu (Kỳ hạn Tháng 12 ZWZ6): </w:t>
-      </w:r>
-      <w:r>
-        <w:t>570.00 - 585.00 cents.</w:t>
-        <w:br/>
-      </w:r>
-    </w:p>
-    <w:p>
-      <w:r>
-        <w:t>CHIẾN THUẬT: Không All-in tại Đáy 1 (Đầu T7). Hãy rải thảm chia vốn 20-30% thăm dò. Kiên nhẫn phục kích hỏa lực mạnh nhất vào giai đoạn Sóng 2 của Nga (Cuối T7) và gặt Lúa xuân (Tháng 8) để xây một móng bê tông vững chắc trước khi đón siêu sóng Quý 4.</w:t>
-      </w:r>
-    </w:p>
-    <w:p>
-      <w:pPr>
-        <w:pStyle w:val="Heading2"/>
-      </w:pPr>
-      <w:r>
-        <w:rPr>
-          <w:color w:val="003366"/>
-        </w:rPr>
-        <w:t>4.4 Dự phóng Hành động Giá theo Dòng Thời Gian</w:t>
-      </w:r>
-    </w:p>
-    <w:tbl>
-      <w:tblPr>
-        <w:tblStyle w:val="TableGrid"/>
-        <w:tblW w:type="auto" w:w="0"/>
-        <w:tblLook w:firstColumn="1" w:firstRow="1" w:lastColumn="0" w:lastRow="0" w:noHBand="0" w:noVBand="1" w:val="04A0"/>
-      </w:tblPr>
-      <w:tblGrid>
-        <w:gridCol w:w="2880"/>
-        <w:gridCol w:w="2880"/>
-        <w:gridCol w:w="2880"/>
-      </w:tblGrid>
-      <w:tr>
-        <w:tc>
-          <w:tcPr>
-            <w:tcW w:type="dxa" w:w="2880"/>
-          </w:tcPr>
-          <w:p>
-            <w:r>
-              <w:t>Khung Thời Gian</w:t>
-            </w:r>
-          </w:p>
-        </w:tc>
-        <w:tc>
-          <w:tcPr>
-            <w:tcW w:type="dxa" w:w="2880"/>
-          </w:tcPr>
-          <w:p>
-            <w:r>
-              <w:t>Dự báo Hành Động Giá</w:t>
-            </w:r>
-          </w:p>
-        </w:tc>
-        <w:tc>
-          <w:tcPr>
-            <w:tcW w:type="dxa" w:w="2880"/>
-          </w:tcPr>
-          <w:p>
-            <w:r>
-              <w:t>Động Lực Cốt Lõi (Catalyst)</w:t>
-            </w:r>
-          </w:p>
-        </w:tc>
-      </w:tr>
-      <w:tr>
-        <w:tc>
-          <w:tcPr>
-            <w:tcW w:type="dxa" w:w="2880"/>
-          </w:tcPr>
-          <w:p>
-            <w:r>
-              <w:t>Đầu T7 (Hiện tại)</w:t>
-            </w:r>
-          </w:p>
-        </w:tc>
-        <w:tc>
-          <w:tcPr>
-            <w:tcW w:type="dxa" w:w="2880"/>
-          </w:tcPr>
-          <w:p>
-            <w:r>
-              <w:t>Giảm tạo Đáy 1 (570-585)</w:t>
-            </w:r>
-          </w:p>
-        </w:tc>
-        <w:tc>
-          <w:tcPr>
-            <w:tcW w:type="dxa" w:w="2880"/>
-          </w:tcPr>
-          <w:p>
-            <w:r>
-              <w:t>Tiến độ gặt lúa đông Mỹ cán mốc 50-60%. Tâm bão xả hàng nội địa.</w:t>
-            </w:r>
-          </w:p>
-        </w:tc>
-      </w:tr>
-      <w:tr>
-        <w:tc>
-          <w:tcPr>
-            <w:tcW w:type="dxa" w:w="2880"/>
-          </w:tcPr>
-          <w:p>
-            <w:r>
-              <w:t>Cuối T7</w:t>
-            </w:r>
-          </w:p>
-        </w:tc>
-        <w:tc>
-          <w:tcPr>
-            <w:tcW w:type="dxa" w:w="2880"/>
-          </w:tcPr>
-          <w:p>
-            <w:r>
-              <w:t>Đi ngang / Cưa chân bàn</w:t>
-            </w:r>
-          </w:p>
-        </w:tc>
-        <w:tc>
-          <w:tcPr>
-            <w:tcW w:type="dxa" w:w="2880"/>
-          </w:tcPr>
-          <w:p>
-            <w:r>
-              <w:t>Nga trễ hẹn xả hàng ồ ạt ra Biển Đen. Kéo giãn vùng đáy (U-Shape).</w:t>
-            </w:r>
-          </w:p>
-        </w:tc>
-      </w:tr>
-      <w:tr>
-        <w:tc>
-          <w:tcPr>
-            <w:tcW w:type="dxa" w:w="2880"/>
-          </w:tcPr>
-          <w:p>
-            <w:r>
-              <w:t>Tháng 8</w:t>
-            </w:r>
-          </w:p>
-        </w:tc>
-        <w:tc>
-          <w:tcPr>
-            <w:tcW w:type="dxa" w:w="2880"/>
-          </w:tcPr>
-          <w:p>
-            <w:r>
-              <w:t>Đáy 2 / Rũ bỏ cuối cùng</w:t>
-            </w:r>
-          </w:p>
-        </w:tc>
-        <w:tc>
-          <w:tcPr>
-            <w:tcW w:type="dxa" w:w="2880"/>
-          </w:tcPr>
-          <w:p>
-            <w:r>
-              <w:t>Gặt lúa xuân Mỹ (Thấp kỷ lục 56 năm). Xây nền móng bê tông xong.</w:t>
-            </w:r>
-          </w:p>
-        </w:tc>
-      </w:tr>
-      <w:tr>
-        <w:tc>
-          <w:tcPr>
-            <w:tcW w:type="dxa" w:w="2880"/>
-          </w:tcPr>
-          <w:p>
-            <w:r>
-              <w:t>Tháng 9 &amp; 10</w:t>
-            </w:r>
-          </w:p>
-        </w:tc>
-        <w:tc>
-          <w:tcPr>
-            <w:tcW w:type="dxa" w:w="2880"/>
-          </w:tcPr>
-          <w:p>
-            <w:r>
-              <w:t>Bứt phá 680 - 720+</w:t>
-            </w:r>
-          </w:p>
-        </w:tc>
-        <w:tc>
-          <w:tcPr>
-            <w:tcW w:type="dxa" w:w="2880"/>
-          </w:tcPr>
-          <w:p>
-            <w:r>
-              <w:t>Giới đầu cơ hoảng loạn nhận ra thiếu hụt lúa chất lượng cao toàn cầu.</w:t>
-            </w:r>
-          </w:p>
-        </w:tc>
-      </w:tr>
-      <w:tr>
-        <w:tc>
-          <w:tcPr>
-            <w:tcW w:type="dxa" w:w="2880"/>
-          </w:tcPr>
-          <w:p>
-            <w:r>
-              <w:t>Tháng 11 (Quý 4)</w:t>
-            </w:r>
-          </w:p>
-        </w:tc>
-        <w:tc>
-          <w:tcPr>
-            <w:tcW w:type="dxa" w:w="2880"/>
-          </w:tcPr>
-          <w:p>
-            <w:r>
-              <w:t>Đỉnh chu kỳ (760 - 800)</w:t>
-            </w:r>
-          </w:p>
-        </w:tc>
-        <w:tc>
-          <w:tcPr>
-            <w:tcW w:type="dxa" w:w="2880"/>
-          </w:tcPr>
-          <w:p>
-            <w:r>
-              <w:t>Hạn hán El Niño tàn phá Úc/Arg. (Đà tăng bị hãm nhẹ bởi mưa mùa thu ở Mỹ).</w:t>
-            </w:r>
-          </w:p>
-        </w:tc>
-      </w:tr>
-    </w:tbl>
-    <w:p>
-      <w:pPr>
-        <w:pStyle w:val="Heading2"/>
-      </w:pPr>
-      <w:r>
-        <w:rPr>
-          <w:color w:val="003366"/>
-        </w:rPr>
-        <w:t>4.5 Biểu đồ Lúa Mì</w:t>
+        <w:t>3.5 Biểu đồ Lúa Mì</w:t>
       </w:r>
     </w:p>
     <w:p>

</xml_diff>

<commit_message>
Restore original Word report filename
</commit_message>
<xml_diff>
--- a/Daily Reports/Ma_Tran_Mua_Vu_Toan_Dien_2026.docx
+++ b/Daily Reports/Ma_Tran_Mua_Vu_Toan_Dien_2026.docx
@@ -217,6 +217,216 @@
         <w:t>Nga nắm giữ 25% thị phần xuất khẩu lúa mì toàn cầu. Sản lượng và chính sách xuất khẩu của Nga là yếu tố quyết định giá trần (Ceiling Price) của lúa mì CBOT trong Quý 3/2026.</w:t>
       </w:r>
     </w:p>
+    <w:p>
+      <w:r>
+        <w:t>Bảng 1: Thông số mùa vụ Lúa mì Nga (Cập nhật: Tháng 7/2026)</w:t>
+      </w:r>
+    </w:p>
+    <w:tbl>
+      <w:tblPr>
+        <w:tblStyle w:val="TableGrid"/>
+        <w:tblW w:type="auto" w:w="0"/>
+        <w:tblLook w:firstColumn="1" w:firstRow="1" w:lastColumn="0" w:lastRow="0" w:noHBand="0" w:noVBand="1" w:val="04A0"/>
+      </w:tblPr>
+      <w:tblGrid>
+        <w:gridCol w:w="2880"/>
+        <w:gridCol w:w="2880"/>
+        <w:gridCol w:w="2880"/>
+      </w:tblGrid>
+      <w:tr>
+        <w:tc>
+          <w:tcPr>
+            <w:tcW w:type="dxa" w:w="2880"/>
+          </w:tcPr>
+          <w:p>
+            <w:r>
+              <w:t>Chỉ Tiêu</w:t>
+            </w:r>
+          </w:p>
+        </w:tc>
+        <w:tc>
+          <w:tcPr>
+            <w:tcW w:type="dxa" w:w="2880"/>
+          </w:tcPr>
+          <w:p>
+            <w:r>
+              <w:t>Số Liệu Cập Nhật</w:t>
+            </w:r>
+          </w:p>
+        </w:tc>
+        <w:tc>
+          <w:tcPr>
+            <w:tcW w:type="dxa" w:w="2880"/>
+          </w:tcPr>
+          <w:p>
+            <w:r>
+              <w:t>Nguồn &amp; Chú thích</w:t>
+            </w:r>
+          </w:p>
+        </w:tc>
+      </w:tr>
+      <w:tr>
+        <w:tc>
+          <w:tcPr>
+            <w:tcW w:type="dxa" w:w="2880"/>
+          </w:tcPr>
+          <w:p>
+            <w:r>
+              <w:t>Diện tích gieo trồng (Acreage)</w:t>
+            </w:r>
+          </w:p>
+        </w:tc>
+        <w:tc>
+          <w:tcPr>
+            <w:tcW w:type="dxa" w:w="2880"/>
+          </w:tcPr>
+          <w:p>
+            <w:r>
+              <w:t>25.8 triệu ha</w:t>
+            </w:r>
+          </w:p>
+        </w:tc>
+        <w:tc>
+          <w:tcPr>
+            <w:tcW w:type="dxa" w:w="2880"/>
+          </w:tcPr>
+          <w:p>
+            <w:r>
+              <w:t>SovEcon (Thấp nhất từ 2014, Xuân: 9.9m, Đông: 15.9m)</w:t>
+            </w:r>
+          </w:p>
+        </w:tc>
+      </w:tr>
+      <w:tr>
+        <w:tc>
+          <w:tcPr>
+            <w:tcW w:type="dxa" w:w="2880"/>
+          </w:tcPr>
+          <w:p>
+            <w:r>
+              <w:t>Sản lượng dự báo (Production)</w:t>
+            </w:r>
+          </w:p>
+        </w:tc>
+        <w:tc>
+          <w:tcPr>
+            <w:tcW w:type="dxa" w:w="2880"/>
+          </w:tcPr>
+          <w:p>
+            <w:r>
+              <w:t>88.9 triệu tấn</w:t>
+            </w:r>
+          </w:p>
+        </w:tc>
+        <w:tc>
+          <w:tcPr>
+            <w:tcW w:type="dxa" w:w="2880"/>
+          </w:tcPr>
+          <w:p>
+            <w:r>
+              <w:t>SovEcon giảm dự báo. (IKAR: 86-91.5m)</w:t>
+            </w:r>
+          </w:p>
+        </w:tc>
+      </w:tr>
+      <w:tr>
+        <w:tc>
+          <w:tcPr>
+            <w:tcW w:type="dxa" w:w="2880"/>
+          </w:tcPr>
+          <w:p>
+            <w:r>
+              <w:t>Tiến độ thu hoạch (Progress)</w:t>
+            </w:r>
+          </w:p>
+        </w:tc>
+        <w:tc>
+          <w:tcPr>
+            <w:tcW w:type="dxa" w:w="2880"/>
+          </w:tcPr>
+          <w:p>
+            <w:r>
+              <w:t>Đạt 3%</w:t>
+            </w:r>
+          </w:p>
+        </w:tc>
+        <w:tc>
+          <w:tcPr>
+            <w:tcW w:type="dxa" w:w="2880"/>
+          </w:tcPr>
+          <w:p>
+            <w:r>
+              <w:t>Trễ 1-2 tuần do mưa lạnh mùa xuân.</w:t>
+            </w:r>
+          </w:p>
+        </w:tc>
+      </w:tr>
+      <w:tr>
+        <w:tc>
+          <w:tcPr>
+            <w:tcW w:type="dxa" w:w="2880"/>
+          </w:tcPr>
+          <w:p>
+            <w:r>
+              <w:t>Giá FOB giao tháng 7</w:t>
+            </w:r>
+          </w:p>
+        </w:tc>
+        <w:tc>
+          <w:tcPr>
+            <w:tcW w:type="dxa" w:w="2880"/>
+          </w:tcPr>
+          <w:p>
+            <w:r>
+              <w:t>$242 / tấn (12.5% pro)</w:t>
+            </w:r>
+          </w:p>
+        </w:tc>
+        <w:tc>
+          <w:tcPr>
+            <w:tcW w:type="dxa" w:w="2880"/>
+          </w:tcPr>
+          <w:p>
+            <w:r>
+              <w:t>Giá đang được neo cao do nông dân găm hàng.</w:t>
+            </w:r>
+          </w:p>
+        </w:tc>
+      </w:tr>
+      <w:tr>
+        <w:tc>
+          <w:tcPr>
+            <w:tcW w:type="dxa" w:w="2880"/>
+          </w:tcPr>
+          <w:p>
+            <w:r>
+              <w:t>Thời gian &amp; Vấn đề mùa vụ</w:t>
+            </w:r>
+          </w:p>
+        </w:tc>
+        <w:tc>
+          <w:tcPr>
+            <w:tcW w:type="dxa" w:w="2880"/>
+          </w:tcPr>
+          <w:p>
+            <w:r>
+              <w:t>Thiếu hụt nhiên liệu</w:t>
+            </w:r>
+          </w:p>
+        </w:tc>
+        <w:tc>
+          <w:tcPr>
+            <w:tcW w:type="dxa" w:w="2880"/>
+          </w:tcPr>
+          <w:p>
+            <w:r>
+              <w:t>Nông dân thiếu dầu Diesel để chạy máy gặt.</w:t>
+            </w:r>
+          </w:p>
+        </w:tc>
+      </w:tr>
+    </w:tbl>
+    <w:p/>
     <w:p>
       <w:pPr>
         <w:pStyle w:val="ListBullet"/>

</xml_diff>

<commit_message>
Correct Golden Zone timing to Late July / Mid August based on supply convergence
</commit_message>
<xml_diff>
--- a/Daily Reports/Ma_Tran_Mua_Vu_Toan_Dien_2026.docx
+++ b/Daily Reports/Ma_Tran_Mua_Vu_Toan_Dien_2026.docx
@@ -465,10 +465,10 @@
         <w:rPr>
           <w:b/>
         </w:rPr>
-        <w:t xml:space="preserve">Nhịp 1 (Tháng 7) - Rủi ro Bull Trap: </w:t>
+        <w:t xml:space="preserve">Nhịp 1 (Đầu đến Giữa Tháng 7) - Rủi ro Bull Trap: </w:t>
       </w:r>
       <w:r>
-        <w:t>Mỹ gặt lúa đông kết hợp với Nga bắt đầu đưa hàng ra Biển Đen. Giá CBOT bị đè bẹp. Rất nhiều trader phân tích cơ bản (chỉ nhìn hạn hán của Mỹ) sẽ vội vã MUA tại đây và dính Bẫy (Bull Trap).</w:t>
+        <w:t>Mỹ gặt lúa đông kết hợp với Nga bắt đầu đưa hàng ra Biển Đen. Giá CBOT bị đè bẹp. Rất nhiều trader phân tích cơ bản sẽ vội vã MUA tại đây và dính Bẫy (Bull Trap).</w:t>
       </w:r>
     </w:p>
     <w:p>
@@ -479,10 +479,24 @@
         <w:rPr>
           <w:b/>
         </w:rPr>
-        <w:t xml:space="preserve">Nhịp 2 (Tháng 8) - Điểm Mua Vàng: </w:t>
+        <w:t xml:space="preserve">Nhịp 2 (Cuối Tháng 7 đến Giữa Tháng 8) - Điểm Hội Tụ (Vùng Vàng): </w:t>
       </w:r>
       <w:r>
-        <w:t>Nga đã qua đỉnh xả hàng. Mỹ bắt đầu gặt Lúa xuân (năng suất thảm hại do nắng nóng Tháng 7 lộ diện). Áp lực từ Nga giảm + Cú sốc từ Mỹ tăng = Điểm uốn của thị trường (Market Inflection Point).</w:t>
+        <w:t>Đây là lúc sức ép nguồn cung đạt cực đại do va chạm 3 dòng thác: Mỹ dọn kho lúa đông, Nga xả lũ mạnh nhất ra Biển Đen, và lúa xuân Mỹ bắt đầu gặt. Đẩy giá xuống Đáy Tuyệt Đối.</w:t>
+      </w:r>
+    </w:p>
+    <w:p>
+      <w:pPr>
+        <w:pStyle w:val="ListBullet"/>
+      </w:pPr>
+      <w:r>
+        <w:rPr>
+          <w:b/>
+        </w:rPr>
+        <w:t xml:space="preserve">Nhịp 3 (Nửa cuối Tháng 8 &amp; Tháng 9) - Điểm Uốn: </w:t>
+      </w:r>
+      <w:r>
+        <w:t>Nga qua đỉnh xả hàng. Năng suất thảm hại của lúa xuân Mỹ lộ diện. Dòng tiền thông minh bắt đầu đẩy giá bứt phá.</w:t>
       </w:r>
     </w:p>
     <w:p>
@@ -504,10 +518,10 @@
         <w:rPr>
           <w:b/>
         </w:rPr>
-        <w:t xml:space="preserve">Tháng 7: </w:t>
+        <w:t xml:space="preserve">Đầu đến Giữa Tháng 7: </w:t>
       </w:r>
       <w:r>
-        <w:t>Nghiêm cấm All-in Mua lên (Long). Vùng giá 570 - 585 là vùng giá rẻ, nhưng chỉ nên giải ngân 20% - 30% vốn để dò đường. Mọi đợt hồi phục đều có xác suất cao là bẫy săn thanh khoản.</w:t>
+        <w:t>Nghiêm cấm All-in Mua lên (Long). Vùng giá 570 - 585 là vùng giá rẻ, nhưng chỉ nên giải ngân 20% - 30% vốn để dò đường.</w:t>
       </w:r>
     </w:p>
     <w:p>
@@ -518,10 +532,24 @@
         <w:rPr>
           <w:b/>
         </w:rPr>
-        <w:t xml:space="preserve">Tháng 8 &amp; Tháng 9: </w:t>
+        <w:t xml:space="preserve">Cuối Tháng 7 đến Giữa Tháng 8 (Golden Zone): </w:t>
       </w:r>
       <w:r>
-        <w:t>Phục kích Cú nổ (The Breakout). Canh các tín hiệu SMC (MSS) trên khung H4/D1 tại vùng giá đáy khi tin tức xả hàng của Nga đã bão hòa (Priced-in). Dồn hỏa lực mua mạnh.</w:t>
+        <w:t>Khi 3 nguồn cung chạm nhau và giá bị ép xuống cực điểm, đây là lúc canh các tín hiệu SMC trên khung H4/D1 để DỒN HỎA LỰC MUA MẠNH (DCA toàn bộ).</w:t>
+      </w:r>
+    </w:p>
+    <w:p>
+      <w:pPr>
+        <w:pStyle w:val="ListBullet"/>
+      </w:pPr>
+      <w:r>
+        <w:rPr>
+          <w:b/>
+        </w:rPr>
+        <w:t xml:space="preserve">Tháng 9 &amp; Quý 4: </w:t>
+      </w:r>
+      <w:r>
+        <w:t>Phục kích Cú nổ (The Breakout) và Gồng lãi.</w:t>
       </w:r>
     </w:p>
     <w:p>

</xml_diff>